<commit_message>
Muestra imagenes de productos en el catalogo con Coil y actualiza evidencias
</commit_message>
<xml_diff>
--- a/docs/entrega/Entrega_Guia07_Ktor.docx
+++ b/docs/entrega/Entrega_Guia07_Ktor.docx
@@ -7,12 +7,12 @@
         <w:pStyle w:val="Title"/>
       </w:pPr>
       <w:r>
-        <w:t>Guía Práctica N.º 07 - Cliente Ktor y consumo GET inicial</w:t>
+        <w:t>Entregables - Guía Práctica N.º 07</w:t>
       </w:r>
     </w:p>
     <w:p>
       <w:r>
-        <w:t>Proyecto: PharmaMobil (Kotlin Multiplatform)</w:t>
+        <w:t>Cliente Ktor y consumo GET inicial · Proyecto PharmaMobil (Kotlin Multiplatform)</w:t>
         <w:br/>
         <w:t>Autor: Julio Fabián Rodríguez Bazán</w:t>
       </w:r>
@@ -22,17 +22,19 @@
         <w:pStyle w:val="Heading1"/>
       </w:pPr>
       <w:r>
-        <w:t>1. Repositorio</w:t>
+        <w:t>1. Repositorio y rama</w:t>
       </w:r>
     </w:p>
     <w:p>
       <w:r>
-        <w:t>Enlace: https://github.com/fabianrodriguez33/Pharma-Mobil/tree/feature/guia-07-ktor-get</w:t>
+        <w:t>Rama: feature/ktor-client</w:t>
+        <w:br/>
+        <w:t>https://github.com/fabianrodriguez33/Pharma-Mobil/tree/feature/ktor-client</w:t>
       </w:r>
     </w:p>
     <w:p>
       <w:r>
-        <w:t>Commit: "Guia 07: cliente Ktor, consumo GET de productos y pantalla Catalogo API"</w:t>
+        <w:t>Commits descriptivos: ver historial de la rama (cliente Ktor y GET de productos, logger de Ktor y README, imágenes en el catálogo).</w:t>
       </w:r>
     </w:p>
     <w:p>
@@ -40,12 +42,12 @@
         <w:pStyle w:val="Heading1"/>
       </w:pPr>
       <w:r>
-        <w:t>2. Registro de Ktor: petición GET y respuesta 200</w:t>
+        <w:t>2. Registro de Ktor (GET y respuesta 200)</w:t>
       </w:r>
     </w:p>
     <w:p>
       <w:r>
-        <w:t>GET https://api.escuelajs.co/api/v1/products?limit=10 → RESPONSE: 200</w:t>
+        <w:t>Petición GET a https://api.escuelajs.co/api/v1/products?limit=10 y respuesta RESPONSE: 200 (extracto de Logcat, filtro HttpClient).</w:t>
       </w:r>
     </w:p>
     <w:p>
@@ -94,7 +96,7 @@
     </w:p>
     <w:p>
       <w:r>
-        <w:t>Android (emulador Pixel 8):</w:t>
+        <w:t>Emulador Android (Pixel 8): pantalla "Catálogo API" con imagen, nombre y precio de cada producto.</w:t>
       </w:r>
     </w:p>
     <w:p>
@@ -135,7 +137,7 @@
     </w:p>
     <w:p>
       <w:r>
-        <w:t>iOS (simulador): [pendiente: insertar captura tomada en Xcode]</w:t>
+        <w:t>Simulador iOS: [pendiente - insertar aquí la captura tomada en Xcode]</w:t>
       </w:r>
     </w:p>
     <w:p>
@@ -148,7 +150,7 @@
     </w:p>
     <w:p>
       <w:r>
-        <w:t>Con el dispositivo en modo avión (icono visible en la barra de estado), la app muestra el estado de error con el botón "Reintentar" sin cerrarse. Ktor registra: java.net.UnknownHostException: Unable to resolve host "api.escuelajs.co".</w:t>
+        <w:t>Con el modo avión activo (icono en la barra de estado) la app no se cierra: muestra el mensaje de error y el botón "Reintentar". Ktor registra java.net.UnknownHostException: Unable to resolve host "api.escuelajs.co".</w:t>
       </w:r>
     </w:p>
     <w:p>
@@ -192,17 +194,36 @@
         <w:pStyle w:val="Heading1"/>
       </w:pPr>
       <w:r>
-        <w:t>5. Configuración y DTO</w:t>
+        <w:t>5. README.md actualizado</w:t>
       </w:r>
     </w:p>
     <w:p>
+      <w:r>
+        <w:t>El README.md del repositorio documenta lo siguiente:</w:t>
+      </w:r>
+    </w:p>
+    <w:p>
+      <w:pPr>
+        <w:pStyle w:val="ListBullet"/>
+      </w:pPr>
       <w:r>
         <w:t>URL base: https://api.escuelajs.co/api/v1/</w:t>
       </w:r>
     </w:p>
     <w:p>
+      <w:pPr>
+        <w:pStyle w:val="ListBullet"/>
+      </w:pPr>
       <w:r>
         <w:t>Endpoint consumido: GET /products?limit=10</w:t>
+      </w:r>
+    </w:p>
+    <w:p>
+      <w:pPr>
+        <w:pStyle w:val="ListBullet"/>
+      </w:pPr>
+      <w:r>
+        <w:t>Campos del DTO (ProductoDto):</w:t>
       </w:r>
     </w:p>
     <w:tbl>
@@ -233,7 +254,7 @@
           </w:tcPr>
           <w:p>
             <w:r>
-              <w:t>Propiedad (ProductoDto)</w:t>
+              <w:t>Propiedad</w:t>
             </w:r>
           </w:p>
         </w:tc>
@@ -371,7 +392,7 @@
           </w:tcPr>
           <w:p>
             <w:r>
-              <w:t>String = ""</w:t>
+              <w:t>String (por defecto "")</w:t>
             </w:r>
           </w:p>
         </w:tc>
@@ -403,7 +424,7 @@
           </w:tcPr>
           <w:p>
             <w:r>
-              <w:t>List&lt;String&gt; = []</w:t>
+              <w:t>List&lt;String&gt; (por defecto vacía)</w:t>
             </w:r>
           </w:p>
         </w:tc>

</xml_diff>

<commit_message>
Actualiza README y evidencias de la guia 07 con el nuevo diseno
</commit_message>
<xml_diff>
--- a/docs/entrega/Entrega_Guia07_Ktor.docx
+++ b/docs/entrega/Entrega_Guia07_Ktor.docx
@@ -34,7 +34,7 @@
     </w:p>
     <w:p>
       <w:r>
-        <w:t>Commits descriptivos: ver historial de la rama (cliente Ktor y GET de productos, logger de Ktor y README, imágenes en el catálogo).</w:t>
+        <w:t>Commits descriptivos: ver el historial de la rama (cliente Ktor y GET de productos, logger de Ktor y README, imágenes y diseño del catálogo).</w:t>
       </w:r>
     </w:p>
     <w:p>
@@ -47,14 +47,14 @@
     </w:p>
     <w:p>
       <w:r>
-        <w:t>Petición GET a https://api.escuelajs.co/api/v1/products?limit=10 y respuesta RESPONSE: 200 (extracto de Logcat, filtro HttpClient).</w:t>
+        <w:t>Petición GET a https://api.escuelajs.co/api/v1/products?offset=0&amp;limit=10 y respuesta RESPONSE: 200 (extracto de Logcat, filtro HttpClient).</w:t>
       </w:r>
     </w:p>
     <w:p>
       <w:r>
         <w:drawing>
           <wp:inline xmlns:a="http://schemas.openxmlformats.org/drawingml/2006/main" xmlns:pic="http://schemas.openxmlformats.org/drawingml/2006/picture">
-            <wp:extent cx="5760000" cy="564966"/>
+            <wp:extent cx="5760000" cy="525128"/>
             <wp:docPr id="1" name="Picture 1"/>
             <wp:cNvGraphicFramePr>
               <a:graphicFrameLocks noChangeAspect="1"/>
@@ -75,7 +75,7 @@
                   <pic:spPr>
                     <a:xfrm>
                       <a:off x="0" y="0"/>
-                      <a:ext cx="5760000" cy="564966"/>
+                      <a:ext cx="5760000" cy="525128"/>
                     </a:xfrm>
                     <a:prstGeom prst="rect"/>
                   </pic:spPr>
@@ -96,7 +96,7 @@
     </w:p>
     <w:p>
       <w:r>
-        <w:t>Emulador Android (Pixel 8): pantalla "Catálogo API" con imagen, nombre y precio de cada producto.</w:t>
+        <w:t>Emulador Android (Pixel 8): catálogo en cuadrícula con imagen, nombre y precio de cada producto.</w:t>
       </w:r>
     </w:p>
     <w:p>
@@ -215,7 +215,7 @@
         <w:pStyle w:val="ListBullet"/>
       </w:pPr>
       <w:r>
-        <w:t>Endpoint consumido: GET /products?limit=10</w:t>
+        <w:t>Endpoint consumido: GET /products?offset=0&amp;limit=10</w:t>
       </w:r>
     </w:p>
     <w:p>

</xml_diff>